<commit_message>
Ajout et correction exercices 11 partie 1 6ème
</commit_message>
<xml_diff>
--- a/Cours/6eme/SaintExupery/Chapitre_11_1/Documents/Chapitre 11 - Partie 1 - Se repérer dans l’espace (A trou).docx
+++ b/Cours/6eme/SaintExupery/Chapitre_11_1/Documents/Chapitre 11 - Partie 1 - Se repérer dans l’espace (A trou).docx
@@ -249,7 +249,7 @@
     <w:tbl>
       <w:tblPr>
         <w:tblStyle w:val="Grilledutableau"/>
-        <w:tblW w:w="0" w:type="auto"/>
+        <w:tblW w:w="9919" w:type="dxa"/>
         <w:tblBorders>
           <w:top w:val="none" w:sz="0" w:space="0" w:color="auto"/>
           <w:left w:val="none" w:sz="0" w:space="0" w:color="auto"/>
@@ -262,11 +262,13 @@
         <w:tblLook w:val="04A0" w:firstRow="1" w:lastRow="0" w:firstColumn="1" w:lastColumn="0" w:noHBand="0" w:noVBand="1"/>
       </w:tblPr>
       <w:tblGrid>
-        <w:gridCol w:w="1982"/>
-        <w:gridCol w:w="1983"/>
-        <w:gridCol w:w="1982"/>
-        <w:gridCol w:w="1983"/>
-        <w:gridCol w:w="1983"/>
+        <w:gridCol w:w="1417"/>
+        <w:gridCol w:w="1417"/>
+        <w:gridCol w:w="1417"/>
+        <w:gridCol w:w="1417"/>
+        <w:gridCol w:w="1417"/>
+        <w:gridCol w:w="1417"/>
+        <w:gridCol w:w="1417"/>
       </w:tblGrid>
       <w:tr>
         <w:trPr>
@@ -274,7 +276,7 @@
         </w:trPr>
         <w:tc>
           <w:tcPr>
-            <w:tcW w:w="1982" w:type="dxa"/>
+            <w:tcW w:w="1417" w:type="dxa"/>
             <w:vAlign w:val="center"/>
           </w:tcPr>
           <w:p>
@@ -290,9 +292,9 @@
                 <w:lang w:eastAsia="fr-FR"/>
               </w:rPr>
               <w:drawing>
-                <wp:inline distT="0" distB="0" distL="0" distR="0" wp14:anchorId="1BD8D097" wp14:editId="67C6F051">
-                  <wp:extent cx="1080000" cy="1013501"/>
-                  <wp:effectExtent l="0" t="0" r="6350" b="0"/>
+                <wp:inline distT="0" distB="0" distL="0" distR="0" wp14:anchorId="1BD8D097" wp14:editId="1BAA396D">
+                  <wp:extent cx="720000" cy="675667"/>
+                  <wp:effectExtent l="0" t="0" r="4445" b="0"/>
                   <wp:docPr id="13" name="Image 13"/>
                   <wp:cNvGraphicFramePr>
                     <a:graphicFrameLocks xmlns:a="http://schemas.openxmlformats.org/drawingml/2006/main" noChangeAspect="1"/>
@@ -322,7 +324,7 @@
                         <pic:spPr bwMode="auto">
                           <a:xfrm>
                             <a:off x="0" y="0"/>
-                            <a:ext cx="1080000" cy="1013501"/>
+                            <a:ext cx="720000" cy="675667"/>
                           </a:xfrm>
                           <a:prstGeom prst="rect">
                             <a:avLst/>
@@ -342,7 +344,7 @@
         </w:tc>
         <w:tc>
           <w:tcPr>
-            <w:tcW w:w="1983" w:type="dxa"/>
+            <w:tcW w:w="1417" w:type="dxa"/>
             <w:vAlign w:val="center"/>
           </w:tcPr>
           <w:p>
@@ -358,9 +360,9 @@
                 <w:lang w:eastAsia="fr-FR"/>
               </w:rPr>
               <w:drawing>
-                <wp:inline distT="0" distB="0" distL="0" distR="0" wp14:anchorId="55FE4DDC" wp14:editId="17FDC31F">
-                  <wp:extent cx="952732" cy="1080000"/>
-                  <wp:effectExtent l="0" t="0" r="0" b="6350"/>
+                <wp:inline distT="0" distB="0" distL="0" distR="0" wp14:anchorId="55FE4DDC" wp14:editId="2DBF36E8">
+                  <wp:extent cx="720000" cy="816179"/>
+                  <wp:effectExtent l="0" t="0" r="4445" b="3175"/>
                   <wp:docPr id="4" name="Image 4"/>
                   <wp:cNvGraphicFramePr>
                     <a:graphicFrameLocks xmlns:a="http://schemas.openxmlformats.org/drawingml/2006/main" noChangeAspect="1"/>
@@ -390,7 +392,7 @@
                         <pic:spPr bwMode="auto">
                           <a:xfrm>
                             <a:off x="0" y="0"/>
-                            <a:ext cx="952732" cy="1080000"/>
+                            <a:ext cx="720000" cy="816179"/>
                           </a:xfrm>
                           <a:prstGeom prst="rect">
                             <a:avLst/>
@@ -410,7 +412,7 @@
         </w:tc>
         <w:tc>
           <w:tcPr>
-            <w:tcW w:w="1982" w:type="dxa"/>
+            <w:tcW w:w="1417" w:type="dxa"/>
             <w:vAlign w:val="center"/>
           </w:tcPr>
           <w:p>
@@ -426,9 +428,9 @@
                 <w:lang w:eastAsia="fr-FR"/>
               </w:rPr>
               <w:drawing>
-                <wp:inline distT="0" distB="0" distL="0" distR="0" wp14:anchorId="7D3339B3" wp14:editId="31398622">
-                  <wp:extent cx="1080000" cy="762773"/>
-                  <wp:effectExtent l="0" t="0" r="6350" b="0"/>
+                <wp:inline distT="0" distB="0" distL="0" distR="0" wp14:anchorId="7D3339B3" wp14:editId="6E9D908C">
+                  <wp:extent cx="720000" cy="508515"/>
+                  <wp:effectExtent l="0" t="0" r="4445" b="6350"/>
                   <wp:docPr id="5" name="Image 5"/>
                   <wp:cNvGraphicFramePr>
                     <a:graphicFrameLocks xmlns:a="http://schemas.openxmlformats.org/drawingml/2006/main" noChangeAspect="1"/>
@@ -458,7 +460,7 @@
                         <pic:spPr bwMode="auto">
                           <a:xfrm>
                             <a:off x="0" y="0"/>
-                            <a:ext cx="1080000" cy="762773"/>
+                            <a:ext cx="720000" cy="508515"/>
                           </a:xfrm>
                           <a:prstGeom prst="rect">
                             <a:avLst/>
@@ -478,7 +480,7 @@
         </w:tc>
         <w:tc>
           <w:tcPr>
-            <w:tcW w:w="1983" w:type="dxa"/>
+            <w:tcW w:w="1417" w:type="dxa"/>
             <w:vAlign w:val="center"/>
           </w:tcPr>
           <w:p>
@@ -494,9 +496,9 @@
                 <w:lang w:eastAsia="fr-FR"/>
               </w:rPr>
               <w:drawing>
-                <wp:inline distT="0" distB="0" distL="0" distR="0" wp14:anchorId="06DB94CE" wp14:editId="30E85D22">
-                  <wp:extent cx="1260000" cy="528953"/>
-                  <wp:effectExtent l="0" t="0" r="0" b="5080"/>
+                <wp:inline distT="0" distB="0" distL="0" distR="0" wp14:anchorId="06DB94CE" wp14:editId="04F964D2">
+                  <wp:extent cx="972000" cy="408050"/>
+                  <wp:effectExtent l="0" t="266700" r="0" b="240030"/>
                   <wp:docPr id="6" name="Image 6"/>
                   <wp:cNvGraphicFramePr>
                     <a:graphicFrameLocks xmlns:a="http://schemas.openxmlformats.org/drawingml/2006/main" noChangeAspect="1"/>
@@ -524,9 +526,9 @@
                           </a:stretch>
                         </pic:blipFill>
                         <pic:spPr bwMode="auto">
-                          <a:xfrm>
+                          <a:xfrm rot="19374474">
                             <a:off x="0" y="0"/>
-                            <a:ext cx="1260000" cy="528953"/>
+                            <a:ext cx="972000" cy="408050"/>
                           </a:xfrm>
                           <a:prstGeom prst="rect">
                             <a:avLst/>
@@ -546,7 +548,7 @@
         </w:tc>
         <w:tc>
           <w:tcPr>
-            <w:tcW w:w="1983" w:type="dxa"/>
+            <w:tcW w:w="1417" w:type="dxa"/>
             <w:vAlign w:val="center"/>
           </w:tcPr>
           <w:p>
@@ -562,9 +564,9 @@
                 <w:lang w:eastAsia="fr-FR"/>
               </w:rPr>
               <w:drawing>
-                <wp:inline distT="0" distB="0" distL="0" distR="0" wp14:anchorId="5D49A0F7" wp14:editId="6CB105BC">
-                  <wp:extent cx="1080000" cy="1080000"/>
-                  <wp:effectExtent l="0" t="0" r="6350" b="0"/>
+                <wp:inline distT="0" distB="0" distL="0" distR="0" wp14:anchorId="5D49A0F7" wp14:editId="04A33A1F">
+                  <wp:extent cx="720000" cy="720000"/>
+                  <wp:effectExtent l="0" t="0" r="4445" b="0"/>
                   <wp:docPr id="7" name="Image 7"/>
                   <wp:cNvGraphicFramePr>
                     <a:graphicFrameLocks xmlns:a="http://schemas.openxmlformats.org/drawingml/2006/main" noChangeAspect="1"/>
@@ -594,7 +596,145 @@
                         <pic:spPr bwMode="auto">
                           <a:xfrm>
                             <a:off x="0" y="0"/>
-                            <a:ext cx="1080000" cy="1080000"/>
+                            <a:ext cx="720000" cy="720000"/>
+                          </a:xfrm>
+                          <a:prstGeom prst="rect">
+                            <a:avLst/>
+                          </a:prstGeom>
+                          <a:noFill/>
+                          <a:ln>
+                            <a:noFill/>
+                          </a:ln>
+                        </pic:spPr>
+                      </pic:pic>
+                    </a:graphicData>
+                  </a:graphic>
+                </wp:inline>
+              </w:drawing>
+            </w:r>
+          </w:p>
+        </w:tc>
+        <w:tc>
+          <w:tcPr>
+            <w:tcW w:w="1417" w:type="dxa"/>
+            <w:vAlign w:val="center"/>
+          </w:tcPr>
+          <w:p>
+            <w:pPr>
+              <w:jc w:val="center"/>
+              <w:rPr>
+                <w:noProof/>
+                <w:lang w:eastAsia="fr-FR"/>
+              </w:rPr>
+            </w:pPr>
+            <w:r>
+              <w:rPr>
+                <w:noProof/>
+                <w:lang w:eastAsia="fr-FR"/>
+              </w:rPr>
+              <w:drawing>
+                <wp:inline distT="0" distB="0" distL="0" distR="0" wp14:anchorId="5D84C13D" wp14:editId="2058AAF5">
+                  <wp:extent cx="720000" cy="720000"/>
+                  <wp:effectExtent l="0" t="0" r="4445" b="4445"/>
+                  <wp:docPr id="1" name="Image 1"/>
+                  <wp:cNvGraphicFramePr>
+                    <a:graphicFrameLocks xmlns:a="http://schemas.openxmlformats.org/drawingml/2006/main" noChangeAspect="1"/>
+                  </wp:cNvGraphicFramePr>
+                  <a:graphic xmlns:a="http://schemas.openxmlformats.org/drawingml/2006/main">
+                    <a:graphicData uri="http://schemas.openxmlformats.org/drawingml/2006/picture">
+                      <pic:pic xmlns:pic="http://schemas.openxmlformats.org/drawingml/2006/picture">
+                        <pic:nvPicPr>
+                          <pic:cNvPr id="0" name="Picture 1"/>
+                          <pic:cNvPicPr>
+                            <a:picLocks noChangeAspect="1" noChangeArrowheads="1"/>
+                          </pic:cNvPicPr>
+                        </pic:nvPicPr>
+                        <pic:blipFill>
+                          <a:blip r:embed="rId13" cstate="print">
+                            <a:extLst>
+                              <a:ext uri="{28A0092B-C50C-407E-A947-70E740481C1C}">
+                                <a14:useLocalDpi xmlns:a14="http://schemas.microsoft.com/office/drawing/2010/main" val="0"/>
+                              </a:ext>
+                            </a:extLst>
+                          </a:blip>
+                          <a:srcRect/>
+                          <a:stretch>
+                            <a:fillRect/>
+                          </a:stretch>
+                        </pic:blipFill>
+                        <pic:spPr bwMode="auto">
+                          <a:xfrm>
+                            <a:off x="0" y="0"/>
+                            <a:ext cx="720000" cy="720000"/>
+                          </a:xfrm>
+                          <a:prstGeom prst="rect">
+                            <a:avLst/>
+                          </a:prstGeom>
+                          <a:noFill/>
+                          <a:ln>
+                            <a:noFill/>
+                          </a:ln>
+                        </pic:spPr>
+                      </pic:pic>
+                    </a:graphicData>
+                  </a:graphic>
+                </wp:inline>
+              </w:drawing>
+            </w:r>
+          </w:p>
+        </w:tc>
+        <w:tc>
+          <w:tcPr>
+            <w:tcW w:w="1417" w:type="dxa"/>
+            <w:vAlign w:val="center"/>
+          </w:tcPr>
+          <w:p>
+            <w:pPr>
+              <w:jc w:val="center"/>
+              <w:rPr>
+                <w:noProof/>
+                <w:lang w:eastAsia="fr-FR"/>
+              </w:rPr>
+            </w:pPr>
+            <w:r>
+              <w:rPr>
+                <w:noProof/>
+                <w:lang w:eastAsia="fr-FR"/>
+              </w:rPr>
+              <w:drawing>
+                <wp:inline distT="0" distB="0" distL="0" distR="0" wp14:anchorId="133BFF38" wp14:editId="2F3F0968">
+                  <wp:extent cx="720000" cy="918000"/>
+                  <wp:effectExtent l="0" t="0" r="4445" b="0"/>
+                  <wp:docPr id="3" name="Image 3"/>
+                  <wp:cNvGraphicFramePr>
+                    <a:graphicFrameLocks xmlns:a="http://schemas.openxmlformats.org/drawingml/2006/main" noChangeAspect="1"/>
+                  </wp:cNvGraphicFramePr>
+                  <a:graphic xmlns:a="http://schemas.openxmlformats.org/drawingml/2006/main">
+                    <a:graphicData uri="http://schemas.openxmlformats.org/drawingml/2006/picture">
+                      <pic:pic xmlns:pic="http://schemas.openxmlformats.org/drawingml/2006/picture">
+                        <pic:nvPicPr>
+                          <pic:cNvPr id="0" name="Picture 2"/>
+                          <pic:cNvPicPr>
+                            <a:picLocks noChangeAspect="1" noChangeArrowheads="1"/>
+                          </pic:cNvPicPr>
+                        </pic:nvPicPr>
+                        <pic:blipFill>
+                          <a:blip r:embed="rId14" cstate="print">
+                            <a:extLst>
+                              <a:ext uri="{28A0092B-C50C-407E-A947-70E740481C1C}">
+                                <a14:useLocalDpi xmlns:a14="http://schemas.microsoft.com/office/drawing/2010/main" val="0"/>
+                              </a:ext>
+                            </a:extLst>
+                          </a:blip>
+                          <a:srcRect/>
+                          <a:stretch>
+                            <a:fillRect/>
+                          </a:stretch>
+                        </pic:blipFill>
+                        <pic:spPr bwMode="auto">
+                          <a:xfrm>
+                            <a:off x="0" y="0"/>
+                            <a:ext cx="720000" cy="918000"/>
                           </a:xfrm>
                           <a:prstGeom prst="rect">
                             <a:avLst/>
@@ -1108,6 +1248,7 @@
             </w:pPr>
             <w:r>
               <w:rPr>
+                <w:noProof/>
                 <w:lang w:eastAsia="fr-FR"/>
               </w:rPr>
               <w:drawing>
@@ -1126,10 +1267,10 @@
                           <pic:cNvPicPr/>
                         </pic:nvPicPr>
                         <pic:blipFill>
-                          <a:blip r:embed="rId13">
+                          <a:blip r:embed="rId15">
                             <a:extLst>
                               <a:ext uri="{96DAC541-7B7A-43D3-8B79-37D633B846F1}">
-                                <asvg:svgBlip xmlns:asvg="http://schemas.microsoft.com/office/drawing/2016/SVG/main" r:embed="rId14"/>
+                                <asvg:svgBlip xmlns:asvg="http://schemas.microsoft.com/office/drawing/2016/SVG/main" r:embed="rId16"/>
                               </a:ext>
                             </a:extLst>
                           </a:blip>
@@ -1181,6 +1322,7 @@
             </w:pPr>
             <w:r>
               <w:rPr>
+                <w:noProof/>
                 <w:lang w:eastAsia="fr-FR"/>
               </w:rPr>
               <w:drawing>
@@ -1199,10 +1341,10 @@
                           <pic:cNvPicPr/>
                         </pic:nvPicPr>
                         <pic:blipFill>
-                          <a:blip r:embed="rId15">
+                          <a:blip r:embed="rId17">
                             <a:extLst>
                               <a:ext uri="{96DAC541-7B7A-43D3-8B79-37D633B846F1}">
-                                <asvg:svgBlip xmlns:asvg="http://schemas.microsoft.com/office/drawing/2016/SVG/main" r:embed="rId16"/>
+                                <asvg:svgBlip xmlns:asvg="http://schemas.microsoft.com/office/drawing/2016/SVG/main" r:embed="rId18"/>
                               </a:ext>
                             </a:extLst>
                           </a:blip>
@@ -1254,6 +1396,7 @@
             </w:pPr>
             <w:r>
               <w:rPr>
+                <w:noProof/>
                 <w:lang w:eastAsia="fr-FR"/>
               </w:rPr>
               <w:drawing>
@@ -1272,10 +1415,10 @@
                           <pic:cNvPicPr/>
                         </pic:nvPicPr>
                         <pic:blipFill>
-                          <a:blip r:embed="rId17">
+                          <a:blip r:embed="rId19">
                             <a:extLst>
                               <a:ext uri="{96DAC541-7B7A-43D3-8B79-37D633B846F1}">
-                                <asvg:svgBlip xmlns:asvg="http://schemas.microsoft.com/office/drawing/2016/SVG/main" r:embed="rId18"/>
+                                <asvg:svgBlip xmlns:asvg="http://schemas.microsoft.com/office/drawing/2016/SVG/main" r:embed="rId20"/>
                               </a:ext>
                             </a:extLst>
                           </a:blip>
@@ -1330,6 +1473,7 @@
             </w:pPr>
             <w:r>
               <w:rPr>
+                <w:noProof/>
                 <w:lang w:eastAsia="fr-FR"/>
               </w:rPr>
               <w:drawing>
@@ -1348,10 +1492,10 @@
                           <pic:cNvPicPr/>
                         </pic:nvPicPr>
                         <pic:blipFill>
-                          <a:blip r:embed="rId19">
+                          <a:blip r:embed="rId21">
                             <a:extLst>
                               <a:ext uri="{96DAC541-7B7A-43D3-8B79-37D633B846F1}">
-                                <asvg:svgBlip xmlns:asvg="http://schemas.microsoft.com/office/drawing/2016/SVG/main" r:embed="rId20"/>
+                                <asvg:svgBlip xmlns:asvg="http://schemas.microsoft.com/office/drawing/2016/SVG/main" r:embed="rId22"/>
                               </a:ext>
                             </a:extLst>
                           </a:blip>
@@ -1403,6 +1547,7 @@
             </w:pPr>
             <w:r>
               <w:rPr>
+                <w:noProof/>
                 <w:lang w:eastAsia="fr-FR"/>
               </w:rPr>
               <w:drawing>
@@ -1421,10 +1566,10 @@
                           <pic:cNvPicPr/>
                         </pic:nvPicPr>
                         <pic:blipFill>
-                          <a:blip r:embed="rId21">
+                          <a:blip r:embed="rId23">
                             <a:extLst>
                               <a:ext uri="{96DAC541-7B7A-43D3-8B79-37D633B846F1}">
-                                <asvg:svgBlip xmlns:asvg="http://schemas.microsoft.com/office/drawing/2016/SVG/main" r:embed="rId22"/>
+                                <asvg:svgBlip xmlns:asvg="http://schemas.microsoft.com/office/drawing/2016/SVG/main" r:embed="rId24"/>
                               </a:ext>
                             </a:extLst>
                           </a:blip>
@@ -1492,10 +1637,10 @@
           <w:numId w:val="18"/>
         </w:numPr>
         <w:sectPr>
-          <w:headerReference w:type="default" r:id="rId23"/>
-          <w:footerReference w:type="default" r:id="rId24"/>
-          <w:headerReference w:type="first" r:id="rId25"/>
-          <w:footerReference w:type="first" r:id="rId26"/>
+          <w:headerReference w:type="default" r:id="rId25"/>
+          <w:footerReference w:type="default" r:id="rId26"/>
+          <w:headerReference w:type="first" r:id="rId27"/>
+          <w:footerReference w:type="first" r:id="rId28"/>
           <w:type w:val="continuous"/>
           <w:pgSz w:w="11906" w:h="16838"/>
           <w:pgMar w:top="567" w:right="849" w:bottom="426" w:left="1134" w:header="708" w:footer="123" w:gutter="0"/>
@@ -1564,54 +1709,14 @@
     </w:p>
     <w:p>
       <w:r>
+        <w:rPr>
+          <w:noProof/>
+        </w:rPr>
         <w:drawing>
           <wp:inline distT="0" distB="0" distL="0" distR="0" wp14:anchorId="44756122" wp14:editId="661C3389">
             <wp:extent cx="2098800" cy="2098800"/>
             <wp:effectExtent l="0" t="0" r="0" b="0"/>
             <wp:docPr id="17" name="Graphique 17"/>
-            <wp:cNvGraphicFramePr>
-              <a:graphicFrameLocks xmlns:a="http://schemas.openxmlformats.org/drawingml/2006/main" noChangeAspect="1"/>
-            </wp:cNvGraphicFramePr>
-            <a:graphic xmlns:a="http://schemas.openxmlformats.org/drawingml/2006/main">
-              <a:graphicData uri="http://schemas.openxmlformats.org/drawingml/2006/picture">
-                <pic:pic xmlns:pic="http://schemas.openxmlformats.org/drawingml/2006/picture">
-                  <pic:nvPicPr>
-                    <pic:cNvPr id="1" name=""/>
-                    <pic:cNvPicPr/>
-                  </pic:nvPicPr>
-                  <pic:blipFill>
-                    <a:blip r:embed="rId27">
-                      <a:extLst>
-                        <a:ext uri="{96DAC541-7B7A-43D3-8B79-37D633B846F1}">
-                          <asvg:svgBlip xmlns:asvg="http://schemas.microsoft.com/office/drawing/2016/SVG/main" r:embed="rId28"/>
-                        </a:ext>
-                      </a:extLst>
-                    </a:blip>
-                    <a:stretch>
-                      <a:fillRect/>
-                    </a:stretch>
-                  </pic:blipFill>
-                  <pic:spPr>
-                    <a:xfrm>
-                      <a:off x="0" y="0"/>
-                      <a:ext cx="2098800" cy="2098800"/>
-                    </a:xfrm>
-                    <a:prstGeom prst="rect">
-                      <a:avLst/>
-                    </a:prstGeom>
-                  </pic:spPr>
-                </pic:pic>
-              </a:graphicData>
-            </a:graphic>
-          </wp:inline>
-        </w:drawing>
-      </w:r>
-      <w:r>
-        <w:drawing>
-          <wp:inline distT="0" distB="0" distL="0" distR="0" wp14:anchorId="62F1F4F8" wp14:editId="774FC500">
-            <wp:extent cx="2098800" cy="2098800"/>
-            <wp:effectExtent l="0" t="0" r="0" b="0"/>
-            <wp:docPr id="22" name="Graphique 22"/>
             <wp:cNvGraphicFramePr>
               <a:graphicFrameLocks xmlns:a="http://schemas.openxmlformats.org/drawingml/2006/main" noChangeAspect="1"/>
             </wp:cNvGraphicFramePr>
@@ -1650,11 +1755,14 @@
         </w:drawing>
       </w:r>
       <w:r>
+        <w:rPr>
+          <w:noProof/>
+        </w:rPr>
         <w:drawing>
-          <wp:inline distT="0" distB="0" distL="0" distR="0" wp14:anchorId="4A459B51" wp14:editId="6B645840">
+          <wp:inline distT="0" distB="0" distL="0" distR="0" wp14:anchorId="62F1F4F8" wp14:editId="774FC500">
             <wp:extent cx="2098800" cy="2098800"/>
             <wp:effectExtent l="0" t="0" r="0" b="0"/>
-            <wp:docPr id="23" name="Graphique 23"/>
+            <wp:docPr id="22" name="Graphique 22"/>
             <wp:cNvGraphicFramePr>
               <a:graphicFrameLocks xmlns:a="http://schemas.openxmlformats.org/drawingml/2006/main" noChangeAspect="1"/>
             </wp:cNvGraphicFramePr>
@@ -1692,14 +1800,15 @@
           </wp:inline>
         </w:drawing>
       </w:r>
-    </w:p>
-    <w:p>
       <w:r>
+        <w:rPr>
+          <w:noProof/>
+        </w:rPr>
         <w:drawing>
-          <wp:inline distT="0" distB="0" distL="0" distR="0" wp14:anchorId="039A89B0" wp14:editId="5AA0D0EB">
+          <wp:inline distT="0" distB="0" distL="0" distR="0" wp14:anchorId="4A459B51" wp14:editId="6B645840">
             <wp:extent cx="2098800" cy="2098800"/>
             <wp:effectExtent l="0" t="0" r="0" b="0"/>
-            <wp:docPr id="20" name="Graphique 20"/>
+            <wp:docPr id="23" name="Graphique 23"/>
             <wp:cNvGraphicFramePr>
               <a:graphicFrameLocks xmlns:a="http://schemas.openxmlformats.org/drawingml/2006/main" noChangeAspect="1"/>
             </wp:cNvGraphicFramePr>
@@ -1737,12 +1846,17 @@
           </wp:inline>
         </w:drawing>
       </w:r>
+    </w:p>
+    <w:p>
       <w:r>
+        <w:rPr>
+          <w:noProof/>
+        </w:rPr>
         <w:drawing>
-          <wp:inline distT="0" distB="0" distL="0" distR="0" wp14:anchorId="667BB91C" wp14:editId="33795D09">
+          <wp:inline distT="0" distB="0" distL="0" distR="0" wp14:anchorId="039A89B0" wp14:editId="5AA0D0EB">
             <wp:extent cx="2098800" cy="2098800"/>
             <wp:effectExtent l="0" t="0" r="0" b="0"/>
-            <wp:docPr id="16" name="Graphique 16"/>
+            <wp:docPr id="20" name="Graphique 20"/>
             <wp:cNvGraphicFramePr>
               <a:graphicFrameLocks xmlns:a="http://schemas.openxmlformats.org/drawingml/2006/main" noChangeAspect="1"/>
             </wp:cNvGraphicFramePr>
@@ -1780,25 +1894,15 @@
           </wp:inline>
         </w:drawing>
       </w:r>
-    </w:p>
-    <w:p/>
-    <w:p/>
-    <w:p/>
-    <w:p/>
-    <w:p/>
-    <w:p>
       <w:r>
-        <w:lastRenderedPageBreak/>
-        <w:t>Il est possible d'indiquer le nombre de cube sur les faces pour aider à la représentation.</w:t>
-      </w:r>
-    </w:p>
-    <w:p>
-      <w:r>
+        <w:rPr>
+          <w:noProof/>
+        </w:rPr>
         <w:drawing>
-          <wp:inline distT="0" distB="0" distL="0" distR="0" wp14:anchorId="5B4447A9" wp14:editId="657DF4C9">
+          <wp:inline distT="0" distB="0" distL="0" distR="0" wp14:anchorId="667BB91C" wp14:editId="33795D09">
             <wp:extent cx="2098800" cy="2098800"/>
             <wp:effectExtent l="0" t="0" r="0" b="0"/>
-            <wp:docPr id="28" name="Graphique 28"/>
+            <wp:docPr id="16" name="Graphique 16"/>
             <wp:cNvGraphicFramePr>
               <a:graphicFrameLocks xmlns:a="http://schemas.openxmlformats.org/drawingml/2006/main" noChangeAspect="1"/>
             </wp:cNvGraphicFramePr>
@@ -1810,96 +1914,10 @@
                     <pic:cNvPicPr/>
                   </pic:nvPicPr>
                   <pic:blipFill>
-                    <a:blip r:embed="rId27">
+                    <a:blip r:embed="rId37">
                       <a:extLst>
                         <a:ext uri="{96DAC541-7B7A-43D3-8B79-37D633B846F1}">
-                          <asvg:svgBlip xmlns:asvg="http://schemas.microsoft.com/office/drawing/2016/SVG/main" r:embed="rId28"/>
-                        </a:ext>
-                      </a:extLst>
-                    </a:blip>
-                    <a:stretch>
-                      <a:fillRect/>
-                    </a:stretch>
-                  </pic:blipFill>
-                  <pic:spPr>
-                    <a:xfrm>
-                      <a:off x="0" y="0"/>
-                      <a:ext cx="2098800" cy="2098800"/>
-                    </a:xfrm>
-                    <a:prstGeom prst="rect">
-                      <a:avLst/>
-                    </a:prstGeom>
-                  </pic:spPr>
-                </pic:pic>
-              </a:graphicData>
-            </a:graphic>
-          </wp:inline>
-        </w:drawing>
-      </w:r>
-      <w:r>
-        <w:drawing>
-          <wp:inline distT="0" distB="0" distL="0" distR="0" wp14:anchorId="2C24AD6B" wp14:editId="161DB904">
-            <wp:extent cx="2098800" cy="2098800"/>
-            <wp:effectExtent l="0" t="0" r="0" b="0"/>
-            <wp:docPr id="29" name="Graphique 29"/>
-            <wp:cNvGraphicFramePr>
-              <a:graphicFrameLocks xmlns:a="http://schemas.openxmlformats.org/drawingml/2006/main" noChangeAspect="1"/>
-            </wp:cNvGraphicFramePr>
-            <a:graphic xmlns:a="http://schemas.openxmlformats.org/drawingml/2006/main">
-              <a:graphicData uri="http://schemas.openxmlformats.org/drawingml/2006/picture">
-                <pic:pic xmlns:pic="http://schemas.openxmlformats.org/drawingml/2006/picture">
-                  <pic:nvPicPr>
-                    <pic:cNvPr id="1" name=""/>
-                    <pic:cNvPicPr/>
-                  </pic:nvPicPr>
-                  <pic:blipFill>
-                    <a:blip r:embed="rId29">
-                      <a:extLst>
-                        <a:ext uri="{96DAC541-7B7A-43D3-8B79-37D633B846F1}">
-                          <asvg:svgBlip xmlns:asvg="http://schemas.microsoft.com/office/drawing/2016/SVG/main" r:embed="rId30"/>
-                        </a:ext>
-                      </a:extLst>
-                    </a:blip>
-                    <a:stretch>
-                      <a:fillRect/>
-                    </a:stretch>
-                  </pic:blipFill>
-                  <pic:spPr>
-                    <a:xfrm>
-                      <a:off x="0" y="0"/>
-                      <a:ext cx="2098800" cy="2098800"/>
-                    </a:xfrm>
-                    <a:prstGeom prst="rect">
-                      <a:avLst/>
-                    </a:prstGeom>
-                  </pic:spPr>
-                </pic:pic>
-              </a:graphicData>
-            </a:graphic>
-          </wp:inline>
-        </w:drawing>
-      </w:r>
-      <w:r>
-        <w:drawing>
-          <wp:inline distT="0" distB="0" distL="0" distR="0" wp14:anchorId="0D4F8B73" wp14:editId="3FA568B5">
-            <wp:extent cx="2098800" cy="2098800"/>
-            <wp:effectExtent l="0" t="0" r="0" b="0"/>
-            <wp:docPr id="30" name="Graphique 30"/>
-            <wp:cNvGraphicFramePr>
-              <a:graphicFrameLocks xmlns:a="http://schemas.openxmlformats.org/drawingml/2006/main" noChangeAspect="1"/>
-            </wp:cNvGraphicFramePr>
-            <a:graphic xmlns:a="http://schemas.openxmlformats.org/drawingml/2006/main">
-              <a:graphicData uri="http://schemas.openxmlformats.org/drawingml/2006/picture">
-                <pic:pic xmlns:pic="http://schemas.openxmlformats.org/drawingml/2006/picture">
-                  <pic:nvPicPr>
-                    <pic:cNvPr id="1" name=""/>
-                    <pic:cNvPicPr/>
-                  </pic:nvPicPr>
-                  <pic:blipFill>
-                    <a:blip r:embed="rId31">
-                      <a:extLst>
-                        <a:ext uri="{96DAC541-7B7A-43D3-8B79-37D633B846F1}">
-                          <asvg:svgBlip xmlns:asvg="http://schemas.microsoft.com/office/drawing/2016/SVG/main" r:embed="rId32"/>
+                          <asvg:svgBlip xmlns:asvg="http://schemas.microsoft.com/office/drawing/2016/SVG/main" r:embed="rId38"/>
                         </a:ext>
                       </a:extLst>
                     </a:blip>
@@ -1923,97 +1941,8 @@
         </w:drawing>
       </w:r>
     </w:p>
-    <w:p>
-      <w:r>
-        <w:drawing>
-          <wp:inline distT="0" distB="0" distL="0" distR="0" wp14:anchorId="75D01439" wp14:editId="4AA4CCD0">
-            <wp:extent cx="2098800" cy="2098800"/>
-            <wp:effectExtent l="0" t="0" r="0" b="0"/>
-            <wp:docPr id="21" name="Graphique 21"/>
-            <wp:cNvGraphicFramePr>
-              <a:graphicFrameLocks xmlns:a="http://schemas.openxmlformats.org/drawingml/2006/main" noChangeAspect="1"/>
-            </wp:cNvGraphicFramePr>
-            <a:graphic xmlns:a="http://schemas.openxmlformats.org/drawingml/2006/main">
-              <a:graphicData uri="http://schemas.openxmlformats.org/drawingml/2006/picture">
-                <pic:pic xmlns:pic="http://schemas.openxmlformats.org/drawingml/2006/picture">
-                  <pic:nvPicPr>
-                    <pic:cNvPr id="1" name=""/>
-                    <pic:cNvPicPr/>
-                  </pic:nvPicPr>
-                  <pic:blipFill>
-                    <a:blip r:embed="rId33">
-                      <a:extLst>
-                        <a:ext uri="{96DAC541-7B7A-43D3-8B79-37D633B846F1}">
-                          <asvg:svgBlip xmlns:asvg="http://schemas.microsoft.com/office/drawing/2016/SVG/main" r:embed="rId34"/>
-                        </a:ext>
-                      </a:extLst>
-                    </a:blip>
-                    <a:stretch>
-                      <a:fillRect/>
-                    </a:stretch>
-                  </pic:blipFill>
-                  <pic:spPr>
-                    <a:xfrm>
-                      <a:off x="0" y="0"/>
-                      <a:ext cx="2098800" cy="2098800"/>
-                    </a:xfrm>
-                    <a:prstGeom prst="rect">
-                      <a:avLst/>
-                    </a:prstGeom>
-                  </pic:spPr>
-                </pic:pic>
-              </a:graphicData>
-            </a:graphic>
-          </wp:inline>
-        </w:drawing>
-      </w:r>
-      <w:r>
-        <w:drawing>
-          <wp:inline distT="0" distB="0" distL="0" distR="0" wp14:anchorId="2F521604" wp14:editId="7B2351BE">
-            <wp:extent cx="2098800" cy="2098800"/>
-            <wp:effectExtent l="0" t="0" r="0" b="0"/>
-            <wp:docPr id="27" name="Graphique 27"/>
-            <wp:cNvGraphicFramePr>
-              <a:graphicFrameLocks xmlns:a="http://schemas.openxmlformats.org/drawingml/2006/main" noChangeAspect="1"/>
-            </wp:cNvGraphicFramePr>
-            <a:graphic xmlns:a="http://schemas.openxmlformats.org/drawingml/2006/main">
-              <a:graphicData uri="http://schemas.openxmlformats.org/drawingml/2006/picture">
-                <pic:pic xmlns:pic="http://schemas.openxmlformats.org/drawingml/2006/picture">
-                  <pic:nvPicPr>
-                    <pic:cNvPr id="1" name=""/>
-                    <pic:cNvPicPr/>
-                  </pic:nvPicPr>
-                  <pic:blipFill>
-                    <a:blip r:embed="rId35">
-                      <a:extLst>
-                        <a:ext uri="{96DAC541-7B7A-43D3-8B79-37D633B846F1}">
-                          <asvg:svgBlip xmlns:asvg="http://schemas.microsoft.com/office/drawing/2016/SVG/main" r:embed="rId36"/>
-                        </a:ext>
-                      </a:extLst>
-                    </a:blip>
-                    <a:stretch>
-                      <a:fillRect/>
-                    </a:stretch>
-                  </pic:blipFill>
-                  <pic:spPr>
-                    <a:xfrm>
-                      <a:off x="0" y="0"/>
-                      <a:ext cx="2098800" cy="2098800"/>
-                    </a:xfrm>
-                    <a:prstGeom prst="rect">
-                      <a:avLst/>
-                    </a:prstGeom>
-                  </pic:spPr>
-                </pic:pic>
-              </a:graphicData>
-            </a:graphic>
-          </wp:inline>
-        </w:drawing>
-      </w:r>
-    </w:p>
-    <w:p/>
     <w:sectPr>
-      <w:headerReference w:type="first" r:id="rId37"/>
+      <w:headerReference w:type="first" r:id="rId39"/>
       <w:type w:val="continuous"/>
       <w:pgSz w:w="11906" w:h="16838"/>
       <w:pgMar w:top="709" w:right="849" w:bottom="426" w:left="1134" w:header="708" w:footer="123" w:gutter="0"/>

</xml_diff>